<commit_message>
adding changes to serve.py working version
</commit_message>
<xml_diff>
--- a/explanation.docx
+++ b/explanation.docx
@@ -7,13 +7,37 @@
         <w:pStyle w:val="Title"/>
       </w:pPr>
       <w:r>
-        <w:t xml:space="preserve">Full</w:t>
-      </w:r>
-      <w:r>
-        <w:t xml:space="preserve"> </w:t>
-      </w:r>
-      <w:r>
-        <w:t xml:space="preserve">Stack</w:t>
+        <w:t xml:space="preserve">Building,</w:t>
+      </w:r>
+      <w:r>
+        <w:t xml:space="preserve"> </w:t>
+      </w:r>
+      <w:r>
+        <w:t xml:space="preserve">Deploying</w:t>
+      </w:r>
+      <w:r>
+        <w:t xml:space="preserve"> </w:t>
+      </w:r>
+      <w:r>
+        <w:t xml:space="preserve">and</w:t>
+      </w:r>
+      <w:r>
+        <w:t xml:space="preserve"> </w:t>
+      </w:r>
+      <w:r>
+        <w:t xml:space="preserve">Serving</w:t>
+      </w:r>
+      <w:r>
+        <w:t xml:space="preserve"> </w:t>
+      </w:r>
+      <w:r>
+        <w:t xml:space="preserve">a</w:t>
+      </w:r>
+      <w:r>
+        <w:t xml:space="preserve"> </w:t>
+      </w:r>
+      <w:r>
+        <w:t xml:space="preserve">Sticker</w:t>
       </w:r>
       <w:r>
         <w:t xml:space="preserve"> </w:t>
@@ -43,7 +67,31 @@
         <w:t xml:space="preserve"> </w:t>
       </w:r>
       <w:r>
-        <w:t xml:space="preserve">Application</w:t>
+        <w:t xml:space="preserve">Model</w:t>
+      </w:r>
+      <w:r>
+        <w:t xml:space="preserve"> </w:t>
+      </w:r>
+      <w:r>
+        <w:t xml:space="preserve">with</w:t>
+      </w:r>
+      <w:r>
+        <w:t xml:space="preserve"> </w:t>
+      </w:r>
+      <w:r>
+        <w:t xml:space="preserve">FastAI</w:t>
+      </w:r>
+      <w:r>
+        <w:t xml:space="preserve"> </w:t>
+      </w:r>
+      <w:r>
+        <w:t xml:space="preserve">and</w:t>
+      </w:r>
+      <w:r>
+        <w:t xml:space="preserve"> </w:t>
+      </w:r>
+      <w:r>
+        <w:t xml:space="preserve">Modal</w:t>
       </w:r>
     </w:p>
     <w:p>
@@ -78,15 +126,6 @@
       </w:r>
       <w:r>
         <w:t xml:space="preserve">2025</w:t>
-      </w:r>
-    </w:p>
-    <w:bookmarkStart w:id="71" w:name="X12fb6cfb1c1381ef90e57b7d381537a43556c6f"/>
-    <w:p>
-      <w:pPr>
-        <w:pStyle w:val="Heading1"/>
-      </w:pPr>
-      <w:r>
-        <w:t xml:space="preserve">Building, Deploying and Serving a Sticker Sales Forecasting Machine Learning Model with fastai and Modal</w:t>
       </w:r>
     </w:p>
     <w:bookmarkStart w:id="28" w:name="background"/>
@@ -30174,7 +30213,6 @@
       </w:r>
     </w:p>
     <w:bookmarkEnd w:id="70"/>
-    <w:bookmarkEnd w:id="71"/>
     <w:sectPr/>
   </w:body>
 </w:document>

</xml_diff>